<commit_message>
Atualiza ficha admissional: e-mail, escolaridade, estado civil e CNH
Co-Authored-By: Claude Sonnet 5.5 <noreply@anthropic.com>
Claude-Session: https://claude.ai/code/session_01CZYfs53cnUXnhZ6z1qeekx
</commit_message>
<xml_diff>
--- a/ficha_maria/FICHA_ADMISSIONAL_MARIA_EDUARDA.docx
+++ b/ficha_maria/FICHA_ADMISSIONAL_MARIA_EDUARDA.docx
@@ -1276,9 +1276,14 @@
             </w:r>
           </w:p>
           <w:p>
-            <w:pPr>
-              <w:spacing w:line="140" w:lineRule="exact"/>
-            </w:pPr>
+            <w:r>
+              <w:rPr>
+                <w:b/>
+                <w:color w:val="0B2A6F"/>
+                <w:sz w:val="20"/>
+              </w:rPr>
+              <w:t>NÃO TEM</w:t>
+            </w:r>
           </w:p>
         </w:tc>
         <w:tc>
@@ -1329,9 +1334,14 @@
             </w:r>
           </w:p>
           <w:p>
-            <w:pPr>
-              <w:spacing w:line="140" w:lineRule="exact"/>
-            </w:pPr>
+            <w:r>
+              <w:rPr>
+                <w:b/>
+                <w:color w:val="0B2A6F"/>
+                <w:sz w:val="20"/>
+              </w:rPr>
+              <w:t>eduardadandrade18@gmail.com</w:t>
+            </w:r>
           </w:p>
         </w:tc>
       </w:tr>
@@ -1512,10 +1522,10 @@
             </w:r>
             <w:r>
               <w:rPr>
-                <w:b w:val="0"/>
+                <w:b/>
                 <w:sz w:val="17"/>
               </w:rPr>
-              <w:t xml:space="preserve">(    ) 2º Grau (completo)      </w:t>
+              <w:t xml:space="preserve">( x ) 2º Grau (completo)      </w:t>
             </w:r>
             <w:r>
               <w:rPr>
@@ -1565,9 +1575,14 @@
             </w:r>
           </w:p>
           <w:p>
-            <w:pPr>
-              <w:spacing w:line="140" w:lineRule="exact"/>
-            </w:pPr>
+            <w:r>
+              <w:rPr>
+                <w:b/>
+                <w:color w:val="0B2A6F"/>
+                <w:sz w:val="20"/>
+              </w:rPr>
+              <w:t>NÃO TEM</w:t>
+            </w:r>
           </w:p>
         </w:tc>
         <w:tc>
@@ -1627,9 +1642,14 @@
             </w:r>
           </w:p>
           <w:p>
-            <w:pPr>
-              <w:spacing w:line="140" w:lineRule="exact"/>
-            </w:pPr>
+            <w:r>
+              <w:rPr>
+                <w:b/>
+                <w:color w:val="0B2A6F"/>
+                <w:sz w:val="20"/>
+              </w:rPr>
+              <w:t>SOLTEIRA</w:t>
+            </w:r>
           </w:p>
         </w:tc>
         <w:tc>
@@ -2240,9 +2260,14 @@
             </w:r>
           </w:p>
           <w:p>
-            <w:pPr>
-              <w:spacing w:line="140" w:lineRule="exact"/>
-            </w:pPr>
+            <w:r>
+              <w:rPr>
+                <w:b/>
+                <w:color w:val="0B2A6F"/>
+                <w:sz w:val="20"/>
+              </w:rPr>
+              <w:t>EM ANDAMENTO</w:t>
+            </w:r>
           </w:p>
         </w:tc>
         <w:tc>

</xml_diff>

<commit_message>
Atualiza ficha admissional: raça/cor, reservista, dependentes e VT
Co-Authored-By: Claude Sonnet 5.5 <noreply@anthropic.com>
Claude-Session: https://claude.ai/code/session_01CZYfs53cnUXnhZ6z1qeekx
</commit_message>
<xml_diff>
--- a/ficha_maria/FICHA_ADMISSIONAL_MARIA_EDUARDA.docx
+++ b/ficha_maria/FICHA_ADMISSIONAL_MARIA_EDUARDA.docx
@@ -1733,10 +1733,10 @@
           <w:p>
             <w:r>
               <w:rPr>
-                <w:b w:val="0"/>
+                <w:b/>
                 <w:sz w:val="17"/>
               </w:rPr>
-              <w:t xml:space="preserve">(    ) Branca      </w:t>
+              <w:t xml:space="preserve">( x ) Branca      </w:t>
             </w:r>
             <w:r>
               <w:rPr>
@@ -2549,9 +2549,14 @@
             </w:r>
           </w:p>
           <w:p>
-            <w:pPr>
-              <w:spacing w:line="140" w:lineRule="exact"/>
-            </w:pPr>
+            <w:r>
+              <w:rPr>
+                <w:b/>
+                <w:color w:val="0B2A6F"/>
+                <w:sz w:val="20"/>
+              </w:rPr>
+              <w:t>NÃO TEM</w:t>
+            </w:r>
           </w:p>
         </w:tc>
       </w:tr>
@@ -2997,9 +3002,14 @@
             </w:r>
           </w:p>
           <w:p>
-            <w:pPr>
-              <w:spacing w:line="140" w:lineRule="exact"/>
-            </w:pPr>
+            <w:r>
+              <w:rPr>
+                <w:b/>
+                <w:color w:val="0B2A6F"/>
+                <w:sz w:val="20"/>
+              </w:rPr>
+              <w:t>NÃO TEM</w:t>
+            </w:r>
           </w:p>
         </w:tc>
         <w:tc>
@@ -3482,9 +3492,14 @@
             </w:r>
           </w:p>
           <w:p>
-            <w:pPr>
-              <w:spacing w:line="140" w:lineRule="exact"/>
-            </w:pPr>
+            <w:r>
+              <w:rPr>
+                <w:b/>
+                <w:color w:val="0B2A6F"/>
+                <w:sz w:val="20"/>
+              </w:rPr>
+              <w:t>R$ 12,00</w:t>
+            </w:r>
           </w:p>
         </w:tc>
         <w:tc>

</xml_diff>

<commit_message>
Regenera ficha admissional (Word e PDF) com deficiência e desconto do VT
Co-Authored-By: Claude Sonnet 5.5 <noreply@anthropic.com>
Claude-Session: https://claude.ai/code/session_01CZYfs53cnUXnhZ6z1qeekx
</commit_message>
<xml_diff>
--- a/ficha_maria/FICHA_ADMISSIONAL_MARIA_EDUARDA.docx
+++ b/ficha_maria/FICHA_ADMISSIONAL_MARIA_EDUARDA.docx
@@ -1822,10 +1822,10 @@
             </w:r>
             <w:r>
               <w:rPr>
-                <w:b w:val="0"/>
+                <w:b/>
                 <w:sz w:val="17"/>
               </w:rPr>
-              <w:t xml:space="preserve">(    ) Nenhuma      </w:t>
+              <w:t xml:space="preserve">( x ) Nenhuma      </w:t>
             </w:r>
           </w:p>
         </w:tc>
@@ -3521,9 +3521,14 @@
             </w:r>
           </w:p>
           <w:p>
-            <w:pPr>
-              <w:spacing w:line="140" w:lineRule="exact"/>
-            </w:pPr>
+            <w:r>
+              <w:rPr>
+                <w:b/>
+                <w:color w:val="0B2A6F"/>
+                <w:sz w:val="20"/>
+              </w:rPr>
+              <w:t>6%</w:t>
+            </w:r>
           </w:p>
         </w:tc>
       </w:tr>

</xml_diff>